<commit_message>
sua mau bao cao
</commit_message>
<xml_diff>
--- a/Templates/baocaodokiem_template.docx
+++ b/Templates/baocaodokiem_template.docx
@@ -3378,8 +3378,10 @@
     <w:sectPr>
       <w:headerReference w:type="even" r:id="rId8"/>
       <w:headerReference w:type="default" r:id="rId9"/>
-      <w:footerReference w:type="default" r:id="rId10"/>
-      <w:headerReference w:type="first" r:id="rId11"/>
+      <w:footerReference w:type="even" r:id="rId10"/>
+      <w:footerReference w:type="default" r:id="rId11"/>
+      <w:headerReference w:type="first" r:id="rId12"/>
+      <w:footerReference w:type="first" r:id="rId13"/>
       <w:pgSz w:w="11907" w:h="16840" w:code="9"/>
       <w:pgMar w:top="1134" w:right="851" w:bottom="737" w:left="851" w:header="720" w:footer="720" w:gutter="0"/>
       <w:cols w:space="720"/>
@@ -3415,6 +3417,16 @@
 </file>
 
 <file path=word/footer1.xml><?xml version="1.0" encoding="utf-8"?>
+<w:ftr xmlns:wpc="http://schemas.microsoft.com/office/word/2010/wordprocessingCanvas" xmlns:cx="http://schemas.microsoft.com/office/drawing/2014/chartex" xmlns:cx1="http://schemas.microsoft.com/office/drawing/2015/9/8/chartex" xmlns:cx2="http://schemas.microsoft.com/office/drawing/2015/10/21/chartex" xmlns:cx3="http://schemas.microsoft.com/office/drawing/2016/5/9/chartex" xmlns:cx4="http://schemas.microsoft.com/office/drawing/2016/5/10/chartex" xmlns:cx5="http://schemas.microsoft.com/office/drawing/2016/5/11/chartex" xmlns:cx6="http://schemas.microsoft.com/office/drawing/2016/5/12/chartex" xmlns:cx7="http://schemas.microsoft.com/office/drawing/2016/5/13/chartex" xmlns:cx8="http://schemas.microsoft.com/office/drawing/2016/5/14/chartex" xmlns:mc="http://schemas.openxmlformats.org/markup-compatibility/2006" xmlns:aink="http://schemas.microsoft.com/office/drawing/2016/ink" xmlns:am3d="http://schemas.microsoft.com/office/drawing/2017/model3d" xmlns:o="urn:schemas-microsoft-com:office:office" xmlns:r="http://schemas.openxmlformats.org/officeDocument/2006/relationships" xmlns:m="http://schemas.openxmlformats.org/officeDocument/2006/math" xmlns:v="urn:schemas-microsoft-com:vml" xmlns:wp14="http://schemas.microsoft.com/office/word/2010/wordprocessingDrawing" xmlns:wp="http://schemas.openxmlformats.org/drawingml/2006/wordprocessingDrawing" xmlns:w10="urn:schemas-microsoft-com:office:word" xmlns:w="http://schemas.openxmlformats.org/wordprocessingml/2006/main" xmlns:w14="http://schemas.microsoft.com/office/word/2010/wordml" xmlns:w15="http://schemas.microsoft.com/office/word/2012/wordml" xmlns:w16cex="http://schemas.microsoft.com/office/word/2018/wordml/cex" xmlns:w16cid="http://schemas.microsoft.com/office/word/2016/wordml/cid" xmlns:w16="http://schemas.microsoft.com/office/word/2018/wordml" xmlns:w16sdtdh="http://schemas.microsoft.com/office/word/2020/wordml/sdtdatahash" xmlns:w16se="http://schemas.microsoft.com/office/word/2015/wordml/symex" xmlns:wpg="http://schemas.microsoft.com/office/word/2010/wordprocessingGroup" xmlns:wpi="http://schemas.microsoft.com/office/word/2010/wordprocessingInk" xmlns:wne="http://schemas.microsoft.com/office/word/2006/wordml" xmlns:wps="http://schemas.microsoft.com/office/word/2010/wordprocessingShape" mc:Ignorable="w14 w15 w16se w16cid w16 w16cex w16sdtdh wp14">
+  <w:p>
+    <w:pPr>
+      <w:pStyle w:val="Footer"/>
+    </w:pPr>
+  </w:p>
+</w:ftr>
+</file>
+
+<file path=word/footer2.xml><?xml version="1.0" encoding="utf-8"?>
 <w:ftr xmlns:wpc="http://schemas.microsoft.com/office/word/2010/wordprocessingCanvas" xmlns:cx="http://schemas.microsoft.com/office/drawing/2014/chartex" xmlns:cx1="http://schemas.microsoft.com/office/drawing/2015/9/8/chartex" xmlns:cx2="http://schemas.microsoft.com/office/drawing/2015/10/21/chartex" xmlns:cx3="http://schemas.microsoft.com/office/drawing/2016/5/9/chartex" xmlns:cx4="http://schemas.microsoft.com/office/drawing/2016/5/10/chartex" xmlns:cx5="http://schemas.microsoft.com/office/drawing/2016/5/11/chartex" xmlns:cx6="http://schemas.microsoft.com/office/drawing/2016/5/12/chartex" xmlns:cx7="http://schemas.microsoft.com/office/drawing/2016/5/13/chartex" xmlns:cx8="http://schemas.microsoft.com/office/drawing/2016/5/14/chartex" xmlns:mc="http://schemas.openxmlformats.org/markup-compatibility/2006" xmlns:aink="http://schemas.microsoft.com/office/drawing/2016/ink" xmlns:am3d="http://schemas.microsoft.com/office/drawing/2017/model3d" xmlns:o="urn:schemas-microsoft-com:office:office" xmlns:r="http://schemas.openxmlformats.org/officeDocument/2006/relationships" xmlns:m="http://schemas.openxmlformats.org/officeDocument/2006/math" xmlns:v="urn:schemas-microsoft-com:vml" xmlns:wp14="http://schemas.microsoft.com/office/word/2010/wordprocessingDrawing" xmlns:wp="http://schemas.openxmlformats.org/drawingml/2006/wordprocessingDrawing" xmlns:w10="urn:schemas-microsoft-com:office:word" xmlns:w="http://schemas.openxmlformats.org/wordprocessingml/2006/main" xmlns:w14="http://schemas.microsoft.com/office/word/2010/wordml" xmlns:w15="http://schemas.microsoft.com/office/word/2012/wordml" xmlns:w16cex="http://schemas.microsoft.com/office/word/2018/wordml/cex" xmlns:w16cid="http://schemas.microsoft.com/office/word/2016/wordml/cid" xmlns:w16="http://schemas.microsoft.com/office/word/2018/wordml" xmlns:w16sdtdh="http://schemas.microsoft.com/office/word/2020/wordml/sdtdatahash" xmlns:w16se="http://schemas.microsoft.com/office/word/2015/wordml/symex" xmlns:wpg="http://schemas.microsoft.com/office/word/2010/wordprocessingGroup" xmlns:wpi="http://schemas.microsoft.com/office/word/2010/wordprocessingInk" xmlns:wne="http://schemas.microsoft.com/office/word/2006/wordml" xmlns:wps="http://schemas.microsoft.com/office/word/2010/wordprocessingShape" mc:Ignorable="w14 w15 w16se w16cid w16 w16cex w16sdtdh wp14">
   <w:p>
     <w:pPr>
@@ -3437,7 +3449,7 @@
       <mc:AlternateContent>
         <mc:Choice Requires="wps">
           <w:drawing>
-            <wp:anchor distT="0" distB="0" distL="114300" distR="114300" simplePos="0" relativeHeight="251665408" behindDoc="0" locked="0" layoutInCell="1" allowOverlap="1" wp14:anchorId="4ADFB788" wp14:editId="57EED16C">
+            <wp:anchor distT="0" distB="0" distL="114300" distR="114300" simplePos="0" relativeHeight="251665408" behindDoc="0" locked="0" layoutInCell="1" allowOverlap="1" wp14:anchorId="4ADFB788" wp14:editId="01E4CD8B">
               <wp:simplePos x="0" y="0"/>
               <wp:positionH relativeFrom="leftMargin">
                 <wp:posOffset>111389</wp:posOffset>
@@ -3497,13 +3509,22 @@
         </mc:Choice>
         <mc:Fallback>
           <w:pict>
-            <v:line w14:anchorId="1A65480A" id="Straight Connector 17" o:spid="_x0000_s1026" style="position:absolute;z-index:251665408;visibility:visible;mso-wrap-style:square;mso-width-percent:0;mso-height-percent:0;mso-wrap-distance-left:9pt;mso-wrap-distance-top:0;mso-wrap-distance-right:9pt;mso-wrap-distance-bottom:0;mso-position-horizontal:absolute;mso-position-horizontal-relative:left-margin-area;mso-position-vertical:absolute;mso-position-vertical-relative:text;mso-width-percent:0;mso-height-percent:0;mso-width-relative:margin;mso-height-relative:margin" from="8.75pt,1pt" to="590.2pt,1pt" o:gfxdata="UEsDBBQABgAIAAAAIQC2gziS/gAAAOEBAAATAAAAW0NvbnRlbnRfVHlwZXNdLnhtbJSRQU7DMBBF&#10;90jcwfIWJU67QAgl6YK0S0CoHGBkTxKLZGx5TGhvj5O2G0SRWNoz/78nu9wcxkFMGNg6quQqL6RA&#10;0s5Y6ir5vt9lD1JwBDIwOMJKHpHlpr69KfdHjyxSmriSfYz+USnWPY7AufNIadK6MEJMx9ApD/oD&#10;OlTrorhX2lFEilmcO2RdNtjC5xDF9pCuTyYBB5bi6bQ4syoJ3g9WQ0ymaiLzg5KdCXlKLjvcW893&#10;SUOqXwnz5DrgnHtJTxOsQfEKIT7DmDSUCaxw7Rqn8787ZsmRM9e2VmPeBN4uqYvTtW7jvijg9N/y&#10;JsXecLq0q+WD6m8AAAD//wMAUEsDBBQABgAIAAAAIQA4/SH/1gAAAJQBAAALAAAAX3JlbHMvLnJl&#10;bHOkkMFqwzAMhu+DvYPRfXGawxijTi+j0GvpHsDYimMaW0Yy2fr2M4PBMnrbUb/Q94l/f/hMi1qR&#10;JVI2sOt6UJgd+ZiDgffL8ekFlFSbvV0oo4EbChzGx4f9GRdb25HMsYhqlCwG5lrLq9biZkxWOiqY&#10;22YiTra2kYMu1l1tQD30/bPm3wwYN0x18gb45AdQl1tp5j/sFB2T0FQ7R0nTNEV3j6o9feQzro1i&#10;OWA14Fm+Q8a1a8+Bvu/d/dMb2JY5uiPbhG/ktn4cqGU/er3pcvwCAAD//wMAUEsDBBQABgAIAAAA&#10;IQBVrLF83gEAABAEAAAOAAAAZHJzL2Uyb0RvYy54bWysU02P2yAQvVfqf0DcG9vpR3atOHvIanup&#10;2qjb/gCCIUYCBg00Tv59B5x4V21VaatesGHmvZn3BtZ3J2fZUWE04DveLGrOlJfQG3/o+PdvD29u&#10;OItJ+F5Y8KrjZxX53eb1q/UYWrWEAWyvkBGJj+0YOj6kFNqqinJQTsQFBOUpqAGdSLTFQ9WjGInd&#10;2WpZ1x+qEbAPCFLFSKf3U5BvCr/WSqYvWkeVmO049ZbKimXd57XarEV7QBEGIy9tiH/owgnjqehM&#10;dS+SYD/Q/EbljESIoNNCgqtAayNV0UBqmvoXNY+DCKpoIXNimG2K/49Wfj7ukJmeZrfizAtHM3pM&#10;KMxhSGwL3pODgIyC5NQYYkuArd/hZRfDDrPsk0aXvySInYq759lddUpM0uHq7c27ZdNwJq+x6gkY&#10;MKaPChzLPx23xmfhohXHTzFRMUq9puRj69lILd/W7+uSFsGa/sFYm4MRD/utRXYUeej1qt6WORPF&#10;szTaWU+8WdOkovyls1VTga9Kky/UdzNVyDdSzbRCSuVTk10pTJSdYZpamIGX1v4GvORnqCq39SXg&#10;GVEqg08z2BkP+Ke20+nasp7yrw5MurMFe+jPZb7FGrp2ReHlieR7/Xxf4E8PefMTAAD//wMAUEsD&#10;BBQABgAIAAAAIQBy4BHf2gAAAAcBAAAPAAAAZHJzL2Rvd25yZXYueG1sTI/NTsNADITvSLzDykhc&#10;EN20/LQK2VT8qDcuDTyAmzVJ1Kw37G7a9O1xucBxPOPx52I9uV4dKMTOs4H5LANFXHvbcWPg82Nz&#10;uwIVE7LF3jMZOFGEdXl5UWBu/ZG3dKhSo6SEY44G2pSGXOtYt+QwzvxALN6XDw6TyNBoG/Ao5a7X&#10;iyx71A47lgstDvTaUr2vRicY7y9D5cPNm06nZRi7u+9hs0djrq+m5ydQiab0F4YzvuxAKUw7P7KN&#10;qhe9fJCkgYV8dLbnq+we1O53oMtC/+cvfwAAAP//AwBQSwECLQAUAAYACAAAACEAtoM4kv4AAADh&#10;AQAAEwAAAAAAAAAAAAAAAAAAAAAAW0NvbnRlbnRfVHlwZXNdLnhtbFBLAQItABQABgAIAAAAIQA4&#10;/SH/1gAAAJQBAAALAAAAAAAAAAAAAAAAAC8BAABfcmVscy8ucmVsc1BLAQItABQABgAIAAAAIQBV&#10;rLF83gEAABAEAAAOAAAAAAAAAAAAAAAAAC4CAABkcnMvZTJvRG9jLnhtbFBLAQItABQABgAIAAAA&#10;IQBy4BHf2gAAAAcBAAAPAAAAAAAAAAAAAAAAADgEAABkcnMvZG93bnJldi54bWxQSwUGAAAAAAQA&#10;BADzAAAAPwUAAAAA&#10;" strokecolor="#0070c0" strokeweight="1.5pt">
+            <v:line w14:anchorId="718F3F58" id="Straight Connector 17" o:spid="_x0000_s1026" style="position:absolute;z-index:251665408;visibility:visible;mso-wrap-style:square;mso-width-percent:0;mso-height-percent:0;mso-wrap-distance-left:9pt;mso-wrap-distance-top:0;mso-wrap-distance-right:9pt;mso-wrap-distance-bottom:0;mso-position-horizontal:absolute;mso-position-horizontal-relative:left-margin-area;mso-position-vertical:absolute;mso-position-vertical-relative:text;mso-width-percent:0;mso-height-percent:0;mso-width-relative:margin;mso-height-relative:margin" from="8.75pt,1pt" to="590.2pt,1pt" o:gfxdata="UEsDBBQABgAIAAAAIQC2gziS/gAAAOEBAAATAAAAW0NvbnRlbnRfVHlwZXNdLnhtbJSRQU7DMBBF&#10;90jcwfIWJU67QAgl6YK0S0CoHGBkTxKLZGx5TGhvj5O2G0SRWNoz/78nu9wcxkFMGNg6quQqL6RA&#10;0s5Y6ir5vt9lD1JwBDIwOMJKHpHlpr69KfdHjyxSmriSfYz+USnWPY7AufNIadK6MEJMx9ApD/oD&#10;OlTrorhX2lFEilmcO2RdNtjC5xDF9pCuTyYBB5bi6bQ4syoJ3g9WQ0ymaiLzg5KdCXlKLjvcW893&#10;SUOqXwnz5DrgnHtJTxOsQfEKIT7DmDSUCaxw7Rqn8787ZsmRM9e2VmPeBN4uqYvTtW7jvijg9N/y&#10;JsXecLq0q+WD6m8AAAD//wMAUEsDBBQABgAIAAAAIQA4/SH/1gAAAJQBAAALAAAAX3JlbHMvLnJl&#10;bHOkkMFqwzAMhu+DvYPRfXGawxijTi+j0GvpHsDYimMaW0Yy2fr2M4PBMnrbUb/Q94l/f/hMi1qR&#10;JVI2sOt6UJgd+ZiDgffL8ekFlFSbvV0oo4EbChzGx4f9GRdb25HMsYhqlCwG5lrLq9biZkxWOiqY&#10;22YiTra2kYMu1l1tQD30/bPm3wwYN0x18gb45AdQl1tp5j/sFB2T0FQ7R0nTNEV3j6o9feQzro1i&#10;OWA14Fm+Q8a1a8+Bvu/d/dMb2JY5uiPbhG/ktn4cqGU/er3pcvwCAAD//wMAUEsDBBQABgAIAAAA&#10;IQBVrLF83gEAABAEAAAOAAAAZHJzL2Uyb0RvYy54bWysU02P2yAQvVfqf0DcG9vpR3atOHvIanup&#10;2qjb/gCCIUYCBg00Tv59B5x4V21VaatesGHmvZn3BtZ3J2fZUWE04DveLGrOlJfQG3/o+PdvD29u&#10;OItJ+F5Y8KrjZxX53eb1q/UYWrWEAWyvkBGJj+0YOj6kFNqqinJQTsQFBOUpqAGdSLTFQ9WjGInd&#10;2WpZ1x+qEbAPCFLFSKf3U5BvCr/WSqYvWkeVmO049ZbKimXd57XarEV7QBEGIy9tiH/owgnjqehM&#10;dS+SYD/Q/EbljESIoNNCgqtAayNV0UBqmvoXNY+DCKpoIXNimG2K/49Wfj7ukJmeZrfizAtHM3pM&#10;KMxhSGwL3pODgIyC5NQYYkuArd/hZRfDDrPsk0aXvySInYq759lddUpM0uHq7c27ZdNwJq+x6gkY&#10;MKaPChzLPx23xmfhohXHTzFRMUq9puRj69lILd/W7+uSFsGa/sFYm4MRD/utRXYUeej1qt6WORPF&#10;szTaWU+8WdOkovyls1VTga9Kky/UdzNVyDdSzbRCSuVTk10pTJSdYZpamIGX1v4GvORnqCq39SXg&#10;GVEqg08z2BkP+Ke20+nasp7yrw5MurMFe+jPZb7FGrp2ReHlieR7/Xxf4E8PefMTAAD//wMAUEsD&#10;BBQABgAIAAAAIQBy4BHf2gAAAAcBAAAPAAAAZHJzL2Rvd25yZXYueG1sTI/NTsNADITvSLzDykhc&#10;EN20/LQK2VT8qDcuDTyAmzVJ1Kw37G7a9O1xucBxPOPx52I9uV4dKMTOs4H5LANFXHvbcWPg82Nz&#10;uwIVE7LF3jMZOFGEdXl5UWBu/ZG3dKhSo6SEY44G2pSGXOtYt+QwzvxALN6XDw6TyNBoG/Ao5a7X&#10;iyx71A47lgstDvTaUr2vRicY7y9D5cPNm06nZRi7u+9hs0djrq+m5ydQiab0F4YzvuxAKUw7P7KN&#10;qhe9fJCkgYV8dLbnq+we1O53oMtC/+cvfwAAAP//AwBQSwECLQAUAAYACAAAACEAtoM4kv4AAADh&#10;AQAAEwAAAAAAAAAAAAAAAAAAAAAAW0NvbnRlbnRfVHlwZXNdLnhtbFBLAQItABQABgAIAAAAIQA4&#10;/SH/1gAAAJQBAAALAAAAAAAAAAAAAAAAAC8BAABfcmVscy8ucmVsc1BLAQItABQABgAIAAAAIQBV&#10;rLF83gEAABAEAAAOAAAAAAAAAAAAAAAAAC4CAABkcnMvZTJvRG9jLnhtbFBLAQItABQABgAIAAAA&#10;IQBy4BHf2gAAAAcBAAAPAAAAAAAAAAAAAAAAADgEAABkcnMvZG93bnJldi54bWxQSwUGAAAAAAQA&#10;BADzAAAAPwUAAAAA&#10;" strokecolor="#0070c0" strokeweight="1.5pt">
               <v:stroke joinstyle="miter"/>
               <w10:wrap anchorx="margin"/>
             </v:line>
           </w:pict>
         </mc:Fallback>
       </mc:AlternateContent>
+    </w:r>
+    <w:r>
+      <w:rPr>
+        <w:rFonts w:ascii="Arial" w:hAnsi="Arial" w:cs="Arial"/>
+        <w:color w:val="0070C0"/>
+        <w:sz w:val="16"/>
+        <w:szCs w:val="16"/>
+      </w:rPr>
+      <w:t>`</w:t>
     </w:r>
   </w:p>
   <w:p>
@@ -3720,6 +3741,16 @@
       </w:rPr>
       <w:t xml:space="preserve"> Lần ban hành/sửa đổi: 01/00</w:t>
     </w:r>
+  </w:p>
+</w:ftr>
+</file>
+
+<file path=word/footer3.xml><?xml version="1.0" encoding="utf-8"?>
+<w:ftr xmlns:wpc="http://schemas.microsoft.com/office/word/2010/wordprocessingCanvas" xmlns:cx="http://schemas.microsoft.com/office/drawing/2014/chartex" xmlns:cx1="http://schemas.microsoft.com/office/drawing/2015/9/8/chartex" xmlns:cx2="http://schemas.microsoft.com/office/drawing/2015/10/21/chartex" xmlns:cx3="http://schemas.microsoft.com/office/drawing/2016/5/9/chartex" xmlns:cx4="http://schemas.microsoft.com/office/drawing/2016/5/10/chartex" xmlns:cx5="http://schemas.microsoft.com/office/drawing/2016/5/11/chartex" xmlns:cx6="http://schemas.microsoft.com/office/drawing/2016/5/12/chartex" xmlns:cx7="http://schemas.microsoft.com/office/drawing/2016/5/13/chartex" xmlns:cx8="http://schemas.microsoft.com/office/drawing/2016/5/14/chartex" xmlns:mc="http://schemas.openxmlformats.org/markup-compatibility/2006" xmlns:aink="http://schemas.microsoft.com/office/drawing/2016/ink" xmlns:am3d="http://schemas.microsoft.com/office/drawing/2017/model3d" xmlns:o="urn:schemas-microsoft-com:office:office" xmlns:r="http://schemas.openxmlformats.org/officeDocument/2006/relationships" xmlns:m="http://schemas.openxmlformats.org/officeDocument/2006/math" xmlns:v="urn:schemas-microsoft-com:vml" xmlns:wp14="http://schemas.microsoft.com/office/word/2010/wordprocessingDrawing" xmlns:wp="http://schemas.openxmlformats.org/drawingml/2006/wordprocessingDrawing" xmlns:w10="urn:schemas-microsoft-com:office:word" xmlns:w="http://schemas.openxmlformats.org/wordprocessingml/2006/main" xmlns:w14="http://schemas.microsoft.com/office/word/2010/wordml" xmlns:w15="http://schemas.microsoft.com/office/word/2012/wordml" xmlns:w16cex="http://schemas.microsoft.com/office/word/2018/wordml/cex" xmlns:w16cid="http://schemas.microsoft.com/office/word/2016/wordml/cid" xmlns:w16="http://schemas.microsoft.com/office/word/2018/wordml" xmlns:w16sdtdh="http://schemas.microsoft.com/office/word/2020/wordml/sdtdatahash" xmlns:w16se="http://schemas.microsoft.com/office/word/2015/wordml/symex" xmlns:wpg="http://schemas.microsoft.com/office/word/2010/wordprocessingGroup" xmlns:wpi="http://schemas.microsoft.com/office/word/2010/wordprocessingInk" xmlns:wne="http://schemas.microsoft.com/office/word/2006/wordml" xmlns:wps="http://schemas.microsoft.com/office/word/2010/wordprocessingShape" mc:Ignorable="w14 w15 w16se w16cid w16 w16cex w16sdtdh wp14">
+  <w:p>
+    <w:pPr>
+      <w:pStyle w:val="Footer"/>
+    </w:pPr>
   </w:p>
 </w:ftr>
 </file>
@@ -3977,7 +4008,7 @@
                                   <pic:cNvPicPr/>
                                 </pic:nvPicPr>
                                 <pic:blipFill>
-                                  <a:blip r:embed="rId1">
+                                  <a:blip r:embed="rId2">
                                     <a:extLst>
                                       <a:ext uri="{28A0092B-C50C-407E-A947-70E740481C1C}">
                                         <a14:useLocalDpi xmlns:a14="http://schemas.microsoft.com/office/drawing/2010/main" val="0"/>
@@ -4138,7 +4169,7 @@
                             </w:rPr>
                             <w:t xml:space="preserve">                                                         E-mail: </w:t>
                           </w:r>
-                          <w:hyperlink r:id="rId2" w:history="1">
+                          <w:hyperlink r:id="rId3" w:history="1">
                             <w:r>
                               <w:rPr>
                                 <w:rStyle w:val="Hyperlink"/>
@@ -4379,7 +4410,7 @@
                       </w:rPr>
                       <w:t xml:space="preserve">                                                         E-mail: </w:t>
                     </w:r>
-                    <w:hyperlink r:id="rId3" w:history="1">
+                    <w:hyperlink r:id="rId4" w:history="1">
                       <w:r>
                         <w:rPr>
                           <w:rStyle w:val="Hyperlink"/>
@@ -4536,41 +4567,6 @@
           </w:pict>
         </mc:Fallback>
       </mc:AlternateContent>
-    </w:r>
-    <w:r>
-      <w:rPr>
-        <w:noProof/>
-      </w:rPr>
-      <w:pict w14:anchorId="21925A95">
-        <v:shapetype id="_x0000_t136" coordsize="21600,21600" o:spt="136" adj="10800" path="m@7,l@8,m@5,21600l@6,21600e">
-          <v:formulas>
-            <v:f eqn="sum #0 0 10800"/>
-            <v:f eqn="prod #0 2 1"/>
-            <v:f eqn="sum 21600 0 @1"/>
-            <v:f eqn="sum 0 0 @2"/>
-            <v:f eqn="sum 21600 0 @3"/>
-            <v:f eqn="if @0 @3 0"/>
-            <v:f eqn="if @0 21600 @1"/>
-            <v:f eqn="if @0 0 @2"/>
-            <v:f eqn="if @0 @4 21600"/>
-            <v:f eqn="mid @5 @6"/>
-            <v:f eqn="mid @8 @5"/>
-            <v:f eqn="mid @7 @8"/>
-            <v:f eqn="mid @6 @7"/>
-            <v:f eqn="sum @6 0 @5"/>
-          </v:formulas>
-          <v:path textpathok="t" o:connecttype="custom" o:connectlocs="@9,0;@10,10800;@11,21600;@12,10800" o:connectangles="270,180,90,0"/>
-          <v:textpath on="t" fitshape="t"/>
-          <v:handles>
-            <v:h position="#0,bottomRight" xrange="6629,14971"/>
-          </v:handles>
-          <o:lock v:ext="edit" text="t" shapetype="t"/>
-        </v:shapetype>
-        <v:shape id="_x0000_s2051" type="#_x0000_t136" style="position:absolute;margin-left:0;margin-top:0;width:430.5pt;height:117pt;rotation:315;z-index:-251644928;mso-position-horizontal:center;mso-position-horizontal-relative:margin;mso-position-vertical:center;mso-position-vertical-relative:margin" o:allowincell="f" fillcolor="#9cc2e5 [1944]" stroked="f">
-          <v:textpath style="font-family:&quot;Arial&quot;;font-size:105pt" string="TESMEA"/>
-          <w10:wrap anchorx="margin" anchory="margin"/>
-        </v:shape>
-      </w:pict>
     </w:r>
     <w:r>
       <w:rPr>
@@ -5187,41 +5183,6 @@
     <w:pPr>
       <w:pStyle w:val="Header"/>
     </w:pPr>
-    <w:r>
-      <w:rPr>
-        <w:noProof/>
-      </w:rPr>
-      <w:pict w14:anchorId="5C8E3C42">
-        <v:shapetype id="_x0000_t136" coordsize="21600,21600" o:spt="136" adj="10800" path="m@7,l@8,m@5,21600l@6,21600e">
-          <v:formulas>
-            <v:f eqn="sum #0 0 10800"/>
-            <v:f eqn="prod #0 2 1"/>
-            <v:f eqn="sum 21600 0 @1"/>
-            <v:f eqn="sum 0 0 @2"/>
-            <v:f eqn="sum 21600 0 @3"/>
-            <v:f eqn="if @0 @3 0"/>
-            <v:f eqn="if @0 21600 @1"/>
-            <v:f eqn="if @0 0 @2"/>
-            <v:f eqn="if @0 @4 21600"/>
-            <v:f eqn="mid @5 @6"/>
-            <v:f eqn="mid @8 @5"/>
-            <v:f eqn="mid @7 @8"/>
-            <v:f eqn="mid @6 @7"/>
-            <v:f eqn="sum @6 0 @5"/>
-          </v:formulas>
-          <v:path textpathok="t" o:connecttype="custom" o:connectlocs="@9,0;@10,10800;@11,21600;@12,10800" o:connectangles="270,180,90,0"/>
-          <v:textpath on="t" fitshape="t"/>
-          <v:handles>
-            <v:h position="#0,bottomRight" xrange="6629,14971"/>
-          </v:handles>
-          <o:lock v:ext="edit" text="t" shapetype="t"/>
-        </v:shapetype>
-        <v:shape id="PowerPlusWaterMarkObject" o:spid="_x0000_s2049" type="#_x0000_t136" style="position:absolute;margin-left:0;margin-top:0;width:430.5pt;height:117pt;rotation:315;z-index:-251649024;mso-position-horizontal:center;mso-position-horizontal-relative:margin;mso-position-vertical:center;mso-position-vertical-relative:margin" o:allowincell="f" fillcolor="#9cc2e5 [1944]" stroked="f">
-          <v:textpath style="font-family:&quot;Arial&quot;;font-size:105pt" string="TESMEA"/>
-          <w10:wrap anchorx="margin" anchory="margin"/>
-        </v:shape>
-      </w:pict>
-    </w:r>
   </w:p>
 </w:hdr>
 </file>

</xml_diff>